<commit_message>
chore: install project dependencies and project initialization files
</commit_message>
<xml_diff>
--- a/DOC's/Nicon commercial.docx
+++ b/DOC's/Nicon commercial.docx
@@ -80,8 +80,9 @@
           <w:sz w:val="24"/>
           <w:lang w:val="en-US"/>
         </w:rPr>
-        <w:t>{{is</w:t>
-      </w:r>
+        <w:t>{{</w:t>
+      </w:r>
+      <w:proofErr w:type="spellStart"/>
       <w:r>
         <w:rPr>
           <w:rFonts w:ascii="Arial" w:eastAsia="Arial" w:hAnsi="Arial" w:cs="Arial"/>
@@ -89,8 +90,18 @@
           <w:sz w:val="24"/>
           <w:lang w:val="en-US"/>
         </w:rPr>
+        <w:t>is</w:t>
+      </w:r>
+      <w:r>
+        <w:rPr>
+          <w:rFonts w:ascii="Arial" w:eastAsia="Arial" w:hAnsi="Arial" w:cs="Arial"/>
+          <w:b/>
+          <w:sz w:val="24"/>
+          <w:lang w:val="en-US"/>
+        </w:rPr>
         <w:t>Data</w:t>
       </w:r>
+      <w:proofErr w:type="spellEnd"/>
       <w:r>
         <w:rPr>
           <w:rFonts w:ascii="Arial" w:eastAsia="Arial" w:hAnsi="Arial" w:cs="Arial"/>
@@ -1803,7 +1814,7 @@
               </wp:inline>
             </w:drawing>
           </mc:Choice>
-          <mc:Fallback xmlns:w16sdtfl="http://schemas.microsoft.com/office/word/2024/wordml/sdtformatlock" xmlns:w16du="http://schemas.microsoft.com/office/word/2023/wordml/word16du" xmlns:oel="http://schemas.microsoft.com/office/2019/extlst">
+          <mc:Fallback xmlns:oel="http://schemas.microsoft.com/office/2019/extlst" xmlns:w16du="http://schemas.microsoft.com/office/word/2023/wordml/word16du" xmlns:w16sdtfl="http://schemas.microsoft.com/office/word/2024/wordml/sdtformatlock">
             <w:pict>
               <v:group w14:anchorId="78D9BCAA" id="Group 858" o:spid="_x0000_s1026" style="width:142.5pt;height:22.5pt;mso-position-horizontal-relative:char;mso-position-vertical-relative:line" coordsize="18097,2857" o:gfxdata="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">
                 <v:shape id="Shape 1143" o:spid="_x0000_s1027" style="position:absolute;width:190;height:2857;visibility:visible;mso-wrap-style:square;v-text-anchor:top" coordsize="19050,285750" o:gfxdata="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" path="m,l19050,r,285750l,285750,,e" fillcolor="black" stroked="f" strokeweight="0">
@@ -2209,16 +2220,7 @@
           <w:sz w:val="21"/>
           <w:lang w:val="en-US"/>
         </w:rPr>
-        <w:t>{{CATEGORY}}</w:t>
-      </w:r>
-      <w:r>
-        <w:rPr>
-          <w:rFonts w:ascii="Arial" w:eastAsia="Arial" w:hAnsi="Arial" w:cs="Arial"/>
-          <w:b/>
-          <w:sz w:val="21"/>
-          <w:lang w:val="en-US"/>
-        </w:rPr>
-        <w:t xml:space="preserve"> </w:t>
+        <w:t xml:space="preserve">{{CATEGORY}} </w:t>
       </w:r>
       <w:r>
         <w:rPr>
@@ -2484,7 +2486,23 @@
           <w:rFonts w:ascii="Arial" w:eastAsia="Arial" w:hAnsi="Arial" w:cs="Arial"/>
           <w:sz w:val="18"/>
         </w:rPr>
-        <w:t>Vehicles (Third Party Insurance) Ordinance, 1945 (Nigeria), the Motor Vehicles (ThirdParty Insurance) Act, 1958 (Ghana), the Motor</w:t>
+        <w:t>Vehicles (Third Party Insurance) Ordinance, 1945 (Nigeria), the Motor Vehicles (</w:t>
+      </w:r>
+      <w:proofErr w:type="spellStart"/>
+      <w:r>
+        <w:rPr>
+          <w:rFonts w:ascii="Arial" w:eastAsia="Arial" w:hAnsi="Arial" w:cs="Arial"/>
+          <w:sz w:val="18"/>
+        </w:rPr>
+        <w:t>ThirdParty</w:t>
+      </w:r>
+      <w:proofErr w:type="spellEnd"/>
+      <w:r>
+        <w:rPr>
+          <w:rFonts w:ascii="Arial" w:eastAsia="Arial" w:hAnsi="Arial" w:cs="Arial"/>
+          <w:sz w:val="18"/>
+        </w:rPr>
+        <w:t xml:space="preserve"> Insurance) Act, 1958 (Ghana), the Motor</w:t>
       </w:r>
     </w:p>
     <w:p>
@@ -2587,6 +2605,9 @@
       <w:pPr>
         <w:spacing w:after="1125" w:line="265" w:lineRule="auto"/>
         <w:ind w:left="860" w:hanging="10"/>
+        <w:rPr>
+          <w:lang w:val="en-US"/>
+        </w:rPr>
       </w:pPr>
       <w:r>
         <w:rPr>
@@ -2686,7 +2707,7 @@
           <w:b/>
           <w:sz w:val="40"/>
         </w:rPr>
-        <w:t xml:space="preserve">    </w:t>
+        <w:t xml:space="preserve">  </w:t>
       </w:r>
       <w:r>
         <w:rPr>
@@ -2695,14 +2716,6 @@
           <w:sz w:val="40"/>
         </w:rPr>
         <w:tab/>
-      </w:r>
-      <w:r>
-        <w:rPr>
-          <w:rFonts w:ascii="Arial" w:eastAsia="Arial" w:hAnsi="Arial" w:cs="Arial"/>
-          <w:b/>
-          <w:sz w:val="40"/>
-        </w:rPr>
-        <w:t>{{</w:t>
       </w:r>
       <w:r>
         <w:rPr>
@@ -2711,7 +2724,7 @@
           <w:sz w:val="40"/>
           <w:lang w:val="en-US"/>
         </w:rPr>
-        <w:t>isPrice</w:t>
+        <w:t>NGN</w:t>
       </w:r>
       <w:r>
         <w:rPr>
@@ -2719,7 +2732,53 @@
           <w:b/>
           <w:sz w:val="40"/>
         </w:rPr>
+        <w:t>{{</w:t>
+      </w:r>
+      <w:proofErr w:type="spellStart"/>
+      <w:r>
+        <w:rPr>
+          <w:rFonts w:ascii="Arial" w:eastAsia="Arial" w:hAnsi="Arial" w:cs="Arial"/>
+          <w:b/>
+          <w:sz w:val="40"/>
+          <w:lang w:val="en-US"/>
+        </w:rPr>
+        <w:t>is</w:t>
+      </w:r>
+      <w:r>
+        <w:rPr>
+          <w:rFonts w:ascii="Arial" w:eastAsia="Arial" w:hAnsi="Arial" w:cs="Arial"/>
+          <w:b/>
+          <w:sz w:val="40"/>
+          <w:lang w:val="en-US"/>
+        </w:rPr>
+        <w:t>p</w:t>
+      </w:r>
+      <w:r>
+        <w:rPr>
+          <w:rFonts w:ascii="Arial" w:eastAsia="Arial" w:hAnsi="Arial" w:cs="Arial"/>
+          <w:b/>
+          <w:sz w:val="40"/>
+          <w:lang w:val="en-US"/>
+        </w:rPr>
+        <w:t>rice</w:t>
+      </w:r>
+      <w:proofErr w:type="spellEnd"/>
+      <w:r>
+        <w:rPr>
+          <w:rFonts w:ascii="Arial" w:eastAsia="Arial" w:hAnsi="Arial" w:cs="Arial"/>
+          <w:b/>
+          <w:sz w:val="40"/>
+        </w:rPr>
         <w:t>}}</w:t>
+      </w:r>
+      <w:r>
+        <w:rPr>
+          <w:rFonts w:ascii="Arial" w:eastAsia="Arial" w:hAnsi="Arial" w:cs="Arial"/>
+          <w:b/>
+          <w:sz w:val="40"/>
+          <w:lang w:val="en-US"/>
+        </w:rPr>
+        <w:t>.00</w:t>
       </w:r>
     </w:p>
     <w:p>

</xml_diff>

<commit_message>
feat: add QR code generation, smart document field scanning, and configurable output paths with updated documentation
</commit_message>
<xml_diff>
--- a/DOC's/Nicon commercial.docx
+++ b/DOC's/Nicon commercial.docx
@@ -1814,7 +1814,7 @@
               </wp:inline>
             </w:drawing>
           </mc:Choice>
-          <mc:Fallback xmlns:oel="http://schemas.microsoft.com/office/2019/extlst" xmlns:w16du="http://schemas.microsoft.com/office/word/2023/wordml/word16du" xmlns:w16sdtfl="http://schemas.microsoft.com/office/word/2024/wordml/sdtformatlock">
+          <mc:Fallback xmlns:w16sdtfl="http://schemas.microsoft.com/office/word/2024/wordml/sdtformatlock" xmlns:w16du="http://schemas.microsoft.com/office/word/2023/wordml/word16du" xmlns:oel="http://schemas.microsoft.com/office/2019/extlst">
             <w:pict>
               <v:group w14:anchorId="78D9BCAA" id="Group 858" o:spid="_x0000_s1026" style="width:142.5pt;height:22.5pt;mso-position-horizontal-relative:char;mso-position-vertical-relative:line" coordsize="18097,2857" o:gfxdata="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">
                 <v:shape id="Shape 1143" o:spid="_x0000_s1027" style="position:absolute;width:190;height:2857;visibility:visible;mso-wrap-style:square;v-text-anchor:top" coordsize="19050,285750" o:gfxdata="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" path="m,l19050,r,285750l,285750,,e" fillcolor="black" stroked="f" strokeweight="0">
@@ -1980,7 +1980,15 @@
           <w:rFonts w:ascii="Arial" w:eastAsia="Arial" w:hAnsi="Arial" w:cs="Arial"/>
           <w:sz w:val="18"/>
         </w:rPr>
-        <w:t xml:space="preserve">     </w:t>
+        <w:t xml:space="preserve">  </w:t>
+      </w:r>
+      <w:proofErr w:type="gramStart"/>
+      <w:r>
+        <w:rPr>
+          <w:rFonts w:ascii="Arial" w:eastAsia="Arial" w:hAnsi="Arial" w:cs="Arial"/>
+          <w:sz w:val="18"/>
+        </w:rPr>
+        <w:t xml:space="preserve">   </w:t>
       </w:r>
       <w:r>
         <w:rPr>
@@ -1989,7 +1997,17 @@
           <w:bCs/>
           <w:sz w:val="21"/>
         </w:rPr>
-        <w:t>{{PLATE_NUMBER}}</w:t>
+        <w:t>{</w:t>
+      </w:r>
+      <w:proofErr w:type="gramEnd"/>
+      <w:r>
+        <w:rPr>
+          <w:rFonts w:ascii="Arial" w:eastAsia="Arial" w:hAnsi="Arial" w:cs="Arial"/>
+          <w:b/>
+          <w:bCs/>
+          <w:sz w:val="21"/>
+        </w:rPr>
+        <w:t>{PLATE_NUMBER}}</w:t>
       </w:r>
     </w:p>
     <w:p>
@@ -2059,7 +2077,16 @@
           <w:b/>
           <w:sz w:val="21"/>
         </w:rPr>
-        <w:t xml:space="preserve">Purposes of the Ordinance(s) </w:t>
+        <w:t>Purposes of the Ordinance(</w:t>
+      </w:r>
+      <w:proofErr w:type="gramStart"/>
+      <w:r>
+        <w:rPr>
+          <w:rFonts w:ascii="Arial" w:eastAsia="Arial" w:hAnsi="Arial" w:cs="Arial"/>
+          <w:b/>
+          <w:sz w:val="21"/>
+        </w:rPr>
+        <w:t xml:space="preserve">s) </w:t>
       </w:r>
       <w:r>
         <w:rPr>
@@ -2075,6 +2102,7 @@
         </w:rPr>
         <w:tab/>
       </w:r>
+      <w:proofErr w:type="gramEnd"/>
       <w:r>
         <w:rPr>
           <w:rFonts w:ascii="Arial" w:eastAsia="Arial" w:hAnsi="Arial" w:cs="Arial"/>
@@ -2088,7 +2116,7 @@
           <w:b/>
           <w:sz w:val="21"/>
         </w:rPr>
-        <w:t>{{REG_DATE}}</w:t>
+        <w:t>{{REG_DATE_DASHED}}</w:t>
       </w:r>
     </w:p>
     <w:p>
@@ -2128,7 +2156,24 @@
           <w:b/>
           <w:sz w:val="21"/>
         </w:rPr>
-        <w:t>{{EXPIRY_DATE}}</w:t>
+        <w:t>{{EXPIRY_DATE</w:t>
+      </w:r>
+      <w:r>
+        <w:rPr>
+          <w:rFonts w:ascii="Arial" w:eastAsia="Arial" w:hAnsi="Arial" w:cs="Arial"/>
+          <w:b/>
+          <w:sz w:val="21"/>
+          <w:lang w:val="en-US"/>
+        </w:rPr>
+        <w:t>_DASHED</w:t>
+      </w:r>
+      <w:r>
+        <w:rPr>
+          <w:rFonts w:ascii="Arial" w:eastAsia="Arial" w:hAnsi="Arial" w:cs="Arial"/>
+          <w:b/>
+          <w:sz w:val="21"/>
+        </w:rPr>
+        <w:t>}}</w:t>
       </w:r>
     </w:p>
     <w:p>
@@ -2220,15 +2265,7 @@
           <w:sz w:val="21"/>
           <w:lang w:val="en-US"/>
         </w:rPr>
-        <w:t xml:space="preserve">{{CATEGORY}} </w:t>
-      </w:r>
-      <w:r>
-        <w:rPr>
-          <w:rFonts w:ascii="Arial" w:eastAsia="Arial" w:hAnsi="Arial" w:cs="Arial"/>
-          <w:b/>
-          <w:sz w:val="21"/>
-        </w:rPr>
-        <w:t xml:space="preserve">(FOR </w:t>
+        <w:t>{{CATEGORY</w:t>
       </w:r>
       <w:r>
         <w:rPr>
@@ -2237,7 +2274,7 @@
           <w:sz w:val="21"/>
           <w:lang w:val="en-US"/>
         </w:rPr>
-        <w:t>{{CATEGORY}}</w:t>
+        <w:t>_UPPER</w:t>
       </w:r>
       <w:r>
         <w:rPr>
@@ -2246,6 +2283,50 @@
           <w:sz w:val="21"/>
           <w:lang w:val="en-US"/>
         </w:rPr>
+        <w:t xml:space="preserve">}} </w:t>
+      </w:r>
+      <w:r>
+        <w:rPr>
+          <w:rFonts w:ascii="Arial" w:eastAsia="Arial" w:hAnsi="Arial" w:cs="Arial"/>
+          <w:b/>
+          <w:sz w:val="21"/>
+        </w:rPr>
+        <w:t xml:space="preserve">(FOR </w:t>
+      </w:r>
+      <w:r>
+        <w:rPr>
+          <w:rFonts w:ascii="Arial" w:eastAsia="Arial" w:hAnsi="Arial" w:cs="Arial"/>
+          <w:b/>
+          <w:sz w:val="21"/>
+          <w:lang w:val="en-US"/>
+        </w:rPr>
+        <w:t>{{CATEGORY</w:t>
+      </w:r>
+      <w:r>
+        <w:rPr>
+          <w:rFonts w:ascii="Arial" w:eastAsia="Arial" w:hAnsi="Arial" w:cs="Arial"/>
+          <w:b/>
+          <w:sz w:val="21"/>
+          <w:lang w:val="en-US"/>
+        </w:rPr>
+        <w:t>_UPPER</w:t>
+      </w:r>
+      <w:r>
+        <w:rPr>
+          <w:rFonts w:ascii="Arial" w:eastAsia="Arial" w:hAnsi="Arial" w:cs="Arial"/>
+          <w:b/>
+          <w:sz w:val="21"/>
+          <w:lang w:val="en-US"/>
+        </w:rPr>
+        <w:t>}}</w:t>
+      </w:r>
+      <w:r>
+        <w:rPr>
+          <w:rFonts w:ascii="Arial" w:eastAsia="Arial" w:hAnsi="Arial" w:cs="Arial"/>
+          <w:b/>
+          <w:sz w:val="21"/>
+          <w:lang w:val="en-US"/>
+        </w:rPr>
         <w:t xml:space="preserve"> </w:t>
       </w:r>
       <w:r>
@@ -2268,7 +2349,25 @@
           <w:b/>
           <w:sz w:val="21"/>
         </w:rPr>
-        <w:t>Use in connection with the Policy holders business; whilst the vehicle is being so used the Carriage of passengers (other than for hire or reward) is permitted.</w:t>
+        <w:t xml:space="preserve">Use in connection with the Policy </w:t>
+      </w:r>
+      <w:proofErr w:type="gramStart"/>
+      <w:r>
+        <w:rPr>
+          <w:rFonts w:ascii="Arial" w:eastAsia="Arial" w:hAnsi="Arial" w:cs="Arial"/>
+          <w:b/>
+          <w:sz w:val="21"/>
+        </w:rPr>
+        <w:t>holders</w:t>
+      </w:r>
+      <w:proofErr w:type="gramEnd"/>
+      <w:r>
+        <w:rPr>
+          <w:rFonts w:ascii="Arial" w:eastAsia="Arial" w:hAnsi="Arial" w:cs="Arial"/>
+          <w:b/>
+          <w:sz w:val="21"/>
+        </w:rPr>
+        <w:t xml:space="preserve"> business; whilst the vehicle is being so used the Carriage of passengers (other than for hire or reward) is permitted.</w:t>
       </w:r>
     </w:p>
     <w:p>
@@ -2515,7 +2614,23 @@
           <w:rFonts w:ascii="Arial" w:eastAsia="Arial" w:hAnsi="Arial" w:cs="Arial"/>
           <w:sz w:val="18"/>
         </w:rPr>
-        <w:t>Vehicles (Third Party Insurance) Ordinance, 1948 (Gambia),and the Motor Vehicles (Third Party Insurance) Ordinance, 1949 (Sierra Leone)</w:t>
+        <w:t>Vehicles (Third Party Insurance) Ordinance, 1948 (Gambia</w:t>
+      </w:r>
+      <w:proofErr w:type="gramStart"/>
+      <w:r>
+        <w:rPr>
+          <w:rFonts w:ascii="Arial" w:eastAsia="Arial" w:hAnsi="Arial" w:cs="Arial"/>
+          <w:sz w:val="18"/>
+        </w:rPr>
+        <w:t>),and</w:t>
+      </w:r>
+      <w:proofErr w:type="gramEnd"/>
+      <w:r>
+        <w:rPr>
+          <w:rFonts w:ascii="Arial" w:eastAsia="Arial" w:hAnsi="Arial" w:cs="Arial"/>
+          <w:sz w:val="18"/>
+        </w:rPr>
+        <w:t xml:space="preserve"> the Motor Vehicles (Third Party Insurance) Ordinance, 1949 (Sierra Leone)</w:t>
       </w:r>
     </w:p>
     <w:p>
@@ -2590,7 +2705,25 @@
           <w:sz w:val="40"/>
           <w:lang w:val="en-US"/>
         </w:rPr>
-        <w:t>{{CATEGORY}}</w:t>
+        <w:t>{{CATEGORY</w:t>
+      </w:r>
+      <w:r>
+        <w:rPr>
+          <w:rFonts w:ascii="Arial" w:eastAsia="Arial" w:hAnsi="Arial" w:cs="Arial"/>
+          <w:b/>
+          <w:sz w:val="40"/>
+          <w:lang w:val="en-US"/>
+        </w:rPr>
+        <w:t>_TITLE</w:t>
+      </w:r>
+      <w:r>
+        <w:rPr>
+          <w:rFonts w:ascii="Arial" w:eastAsia="Arial" w:hAnsi="Arial" w:cs="Arial"/>
+          <w:b/>
+          <w:sz w:val="40"/>
+          <w:lang w:val="en-US"/>
+        </w:rPr>
+        <w:t>}}</w:t>
       </w:r>
       <w:r>
         <w:rPr>

</xml_diff>